<commit_message>
Commiting the draft of the DSA explorer
</commit_message>
<xml_diff>
--- a/Report.docx
+++ b/Report.docx
@@ -5,6 +5,351 @@
     <w:p>
       <w:pPr>
         <w:pStyle w:val="Heading2"/>
+      </w:pPr>
+      <w:r>
+        <w:t xml:space="preserve">Planning </w:t>
+      </w:r>
+    </w:p>
+    <w:p>
+      <w:r>
+        <w:drawing>
+          <wp:anchor distT="0" distB="0" distL="114300" distR="114300" simplePos="0" relativeHeight="251677696" behindDoc="0" locked="0" layoutInCell="1" allowOverlap="1" wp14:anchorId="14A4076E" wp14:editId="10859BA5">
+            <wp:simplePos x="0" y="0"/>
+            <wp:positionH relativeFrom="column">
+              <wp:posOffset>105507</wp:posOffset>
+            </wp:positionH>
+            <wp:positionV relativeFrom="paragraph">
+              <wp:posOffset>810114</wp:posOffset>
+            </wp:positionV>
+            <wp:extent cx="5524500" cy="3873500"/>
+            <wp:effectExtent l="0" t="0" r="0" b="0"/>
+            <wp:wrapTopAndBottom/>
+            <wp:docPr id="937523147" name="Picture 1"/>
+            <wp:cNvGraphicFramePr>
+              <a:graphicFrameLocks xmlns:a="http://schemas.openxmlformats.org/drawingml/2006/main" noChangeAspect="1"/>
+            </wp:cNvGraphicFramePr>
+            <a:graphic xmlns:a="http://schemas.openxmlformats.org/drawingml/2006/main">
+              <a:graphicData uri="http://schemas.openxmlformats.org/drawingml/2006/picture">
+                <pic:pic xmlns:pic="http://schemas.openxmlformats.org/drawingml/2006/picture">
+                  <pic:nvPicPr>
+                    <pic:cNvPr id="937523147" name=""/>
+                    <pic:cNvPicPr/>
+                  </pic:nvPicPr>
+                  <pic:blipFill>
+                    <a:blip r:embed="rId5"/>
+                    <a:stretch>
+                      <a:fillRect/>
+                    </a:stretch>
+                  </pic:blipFill>
+                  <pic:spPr>
+                    <a:xfrm>
+                      <a:off x="0" y="0"/>
+                      <a:ext cx="5524500" cy="3873500"/>
+                    </a:xfrm>
+                    <a:prstGeom prst="rect">
+                      <a:avLst/>
+                    </a:prstGeom>
+                  </pic:spPr>
+                </pic:pic>
+              </a:graphicData>
+            </a:graphic>
+          </wp:anchor>
+        </w:drawing>
+      </w:r>
+      <w:r>
+        <w:t>The team broke down the steps for this assignment</w:t>
+      </w:r>
+      <w:r>
+        <w:t xml:space="preserve">. </w:t>
+      </w:r>
+      <w:proofErr w:type="gramStart"/>
+      <w:r>
+        <w:t>First</w:t>
+      </w:r>
+      <w:proofErr w:type="gramEnd"/>
+      <w:r>
+        <w:t xml:space="preserve"> we are to complete all the tutorial tasks. Then going through the </w:t>
+      </w:r>
+      <w:proofErr w:type="gramStart"/>
+      <w:r>
+        <w:t>assignment</w:t>
+      </w:r>
+      <w:proofErr w:type="gramEnd"/>
+      <w:r>
+        <w:t xml:space="preserve"> we then broke down which </w:t>
+      </w:r>
+      <w:r>
+        <w:t>assessed task was to be assigned for the different components in the D</w:t>
+      </w:r>
+      <w:r>
+        <w:t>SA explorer. We created a navigation map (see below)</w:t>
+      </w:r>
+      <w:r>
+        <w:br/>
+      </w:r>
+    </w:p>
+    <w:p>
+      <w:r>
+        <w:t xml:space="preserve">By breaking up all the tasks into smaller ones it was easier to see which task would be better suited to which category of the DSA Explorer. </w:t>
+      </w:r>
+    </w:p>
+    <w:p>
+      <w:pPr>
+        <w:pStyle w:val="Heading2"/>
+      </w:pPr>
+      <w:r>
+        <w:rPr>
+          <w:noProof/>
+        </w:rPr>
+        <w:drawing>
+          <wp:anchor distT="0" distB="0" distL="114300" distR="114300" simplePos="0" relativeHeight="251679744" behindDoc="0" locked="0" layoutInCell="1" allowOverlap="1" wp14:anchorId="62F2749D" wp14:editId="4F33F98C">
+            <wp:simplePos x="0" y="0"/>
+            <wp:positionH relativeFrom="margin">
+              <wp:posOffset>133448</wp:posOffset>
+            </wp:positionH>
+            <wp:positionV relativeFrom="paragraph">
+              <wp:posOffset>379779</wp:posOffset>
+            </wp:positionV>
+            <wp:extent cx="5731510" cy="2015490"/>
+            <wp:effectExtent l="0" t="0" r="2540" b="3810"/>
+            <wp:wrapTopAndBottom/>
+            <wp:docPr id="1883112243" name="Picture 1">
+              <a:extLst xmlns:a="http://schemas.openxmlformats.org/drawingml/2006/main">
+                <a:ext uri="{FF2B5EF4-FFF2-40B4-BE49-F238E27FC236}">
+                  <a16:creationId xmlns:a16="http://schemas.microsoft.com/office/drawing/2014/main" id="{D6E75595-5711-46D9-8F90-41F8CC2CEA76}"/>
+                </a:ext>
+              </a:extLst>
+            </wp:docPr>
+            <wp:cNvGraphicFramePr>
+              <a:graphicFrameLocks xmlns:a="http://schemas.openxmlformats.org/drawingml/2006/main" noChangeAspect="1"/>
+            </wp:cNvGraphicFramePr>
+            <a:graphic xmlns:a="http://schemas.openxmlformats.org/drawingml/2006/main">
+              <a:graphicData uri="http://schemas.openxmlformats.org/drawingml/2006/picture">
+                <pic:pic xmlns:pic="http://schemas.openxmlformats.org/drawingml/2006/picture">
+                  <pic:nvPicPr>
+                    <pic:cNvPr id="1883112243" name=""/>
+                    <pic:cNvPicPr/>
+                  </pic:nvPicPr>
+                  <pic:blipFill>
+                    <a:blip r:embed="rId6"/>
+                    <a:stretch>
+                      <a:fillRect/>
+                    </a:stretch>
+                  </pic:blipFill>
+                  <pic:spPr>
+                    <a:xfrm>
+                      <a:off x="0" y="0"/>
+                      <a:ext cx="5731510" cy="2015490"/>
+                    </a:xfrm>
+                    <a:prstGeom prst="rect">
+                      <a:avLst/>
+                    </a:prstGeom>
+                  </pic:spPr>
+                </pic:pic>
+              </a:graphicData>
+            </a:graphic>
+          </wp:anchor>
+        </w:drawing>
+      </w:r>
+      <w:r>
+        <w:t>Task</w:t>
+      </w:r>
+      <w:r>
+        <w:t xml:space="preserve"> 1.1 </w:t>
+      </w:r>
+    </w:p>
+    <w:p/>
+    <w:p/>
+    <w:p/>
+    <w:p>
+      <w:pPr>
+        <w:pStyle w:val="Heading2"/>
+      </w:pPr>
+      <w:r>
+        <w:t xml:space="preserve">Task 1.2  </w:t>
+      </w:r>
+    </w:p>
+    <w:p>
+      <w:r>
+        <w:rPr>
+          <w:noProof/>
+        </w:rPr>
+        <w:drawing>
+          <wp:anchor distT="0" distB="0" distL="114300" distR="114300" simplePos="0" relativeHeight="251661312" behindDoc="0" locked="0" layoutInCell="1" allowOverlap="1" wp14:anchorId="5EFF8935" wp14:editId="19C1909A">
+            <wp:simplePos x="0" y="0"/>
+            <wp:positionH relativeFrom="margin">
+              <wp:posOffset>265238</wp:posOffset>
+            </wp:positionH>
+            <wp:positionV relativeFrom="paragraph">
+              <wp:posOffset>241920</wp:posOffset>
+            </wp:positionV>
+            <wp:extent cx="4720590" cy="2325370"/>
+            <wp:effectExtent l="0" t="0" r="3810" b="0"/>
+            <wp:wrapTopAndBottom/>
+            <wp:docPr id="912817332" name="Picture 1">
+              <a:extLst xmlns:a="http://schemas.openxmlformats.org/drawingml/2006/main">
+                <a:ext uri="{FF2B5EF4-FFF2-40B4-BE49-F238E27FC236}">
+                  <a16:creationId xmlns:a16="http://schemas.microsoft.com/office/drawing/2014/main" id="{3A7F082B-4D25-45AE-BB03-C48A7072EC8D}"/>
+                </a:ext>
+              </a:extLst>
+            </wp:docPr>
+            <wp:cNvGraphicFramePr>
+              <a:graphicFrameLocks xmlns:a="http://schemas.openxmlformats.org/drawingml/2006/main" noChangeAspect="1"/>
+            </wp:cNvGraphicFramePr>
+            <a:graphic xmlns:a="http://schemas.openxmlformats.org/drawingml/2006/main">
+              <a:graphicData uri="http://schemas.openxmlformats.org/drawingml/2006/picture">
+                <pic:pic xmlns:pic="http://schemas.openxmlformats.org/drawingml/2006/picture">
+                  <pic:nvPicPr>
+                    <pic:cNvPr id="912817332" name=""/>
+                    <pic:cNvPicPr/>
+                  </pic:nvPicPr>
+                  <pic:blipFill>
+                    <a:blip r:embed="rId7"/>
+                    <a:stretch>
+                      <a:fillRect/>
+                    </a:stretch>
+                  </pic:blipFill>
+                  <pic:spPr>
+                    <a:xfrm>
+                      <a:off x="0" y="0"/>
+                      <a:ext cx="4720590" cy="2325370"/>
+                    </a:xfrm>
+                    <a:prstGeom prst="rect">
+                      <a:avLst/>
+                    </a:prstGeom>
+                  </pic:spPr>
+                </pic:pic>
+              </a:graphicData>
+            </a:graphic>
+            <wp14:sizeRelH relativeFrom="margin">
+              <wp14:pctWidth>0</wp14:pctWidth>
+            </wp14:sizeRelH>
+            <wp14:sizeRelV relativeFrom="margin">
+              <wp14:pctHeight>0</wp14:pctHeight>
+            </wp14:sizeRelV>
+          </wp:anchor>
+        </w:drawing>
+      </w:r>
+      <w:r>
+        <w:t xml:space="preserve">When you click </w:t>
+      </w:r>
+      <w:r>
+        <w:t xml:space="preserve">on the </w:t>
+      </w:r>
+      <w:r>
+        <w:t xml:space="preserve">enqueue button the </w:t>
+      </w:r>
+      <w:r>
+        <w:t xml:space="preserve">numbers all appear in ascending numerical order. </w:t>
+      </w:r>
+    </w:p>
+    <w:p/>
+    <w:p>
+      <w:r>
+        <w:rPr>
+          <w:noProof/>
+        </w:rPr>
+        <w:drawing>
+          <wp:anchor distT="0" distB="0" distL="114300" distR="114300" simplePos="0" relativeHeight="251663360" behindDoc="0" locked="0" layoutInCell="1" allowOverlap="1" wp14:anchorId="6E9C98DA" wp14:editId="20C704E7">
+            <wp:simplePos x="0" y="0"/>
+            <wp:positionH relativeFrom="margin">
+              <wp:posOffset>382668</wp:posOffset>
+            </wp:positionH>
+            <wp:positionV relativeFrom="paragraph">
+              <wp:posOffset>611431</wp:posOffset>
+            </wp:positionV>
+            <wp:extent cx="4754880" cy="2338705"/>
+            <wp:effectExtent l="0" t="0" r="7620" b="4445"/>
+            <wp:wrapTopAndBottom/>
+            <wp:docPr id="1670022679" name="Picture 1">
+              <a:extLst xmlns:a="http://schemas.openxmlformats.org/drawingml/2006/main">
+                <a:ext uri="{FF2B5EF4-FFF2-40B4-BE49-F238E27FC236}">
+                  <a16:creationId xmlns:a16="http://schemas.microsoft.com/office/drawing/2014/main" id="{BEA1CF3F-1539-4864-AB3E-FF48EAC17FE6}"/>
+                </a:ext>
+              </a:extLst>
+            </wp:docPr>
+            <wp:cNvGraphicFramePr>
+              <a:graphicFrameLocks xmlns:a="http://schemas.openxmlformats.org/drawingml/2006/main" noChangeAspect="1"/>
+            </wp:cNvGraphicFramePr>
+            <a:graphic xmlns:a="http://schemas.openxmlformats.org/drawingml/2006/main">
+              <a:graphicData uri="http://schemas.openxmlformats.org/drawingml/2006/picture">
+                <pic:pic xmlns:pic="http://schemas.openxmlformats.org/drawingml/2006/picture">
+                  <pic:nvPicPr>
+                    <pic:cNvPr id="1670022679" name=""/>
+                    <pic:cNvPicPr/>
+                  </pic:nvPicPr>
+                  <pic:blipFill>
+                    <a:blip r:embed="rId8"/>
+                    <a:stretch>
+                      <a:fillRect/>
+                    </a:stretch>
+                  </pic:blipFill>
+                  <pic:spPr>
+                    <a:xfrm>
+                      <a:off x="0" y="0"/>
+                      <a:ext cx="4754880" cy="2338705"/>
+                    </a:xfrm>
+                    <a:prstGeom prst="rect">
+                      <a:avLst/>
+                    </a:prstGeom>
+                  </pic:spPr>
+                </pic:pic>
+              </a:graphicData>
+            </a:graphic>
+            <wp14:sizeRelH relativeFrom="margin">
+              <wp14:pctWidth>0</wp14:pctWidth>
+            </wp14:sizeRelH>
+            <wp14:sizeRelV relativeFrom="margin">
+              <wp14:pctHeight>0</wp14:pctHeight>
+            </wp14:sizeRelV>
+          </wp:anchor>
+        </w:drawing>
+      </w:r>
+      <w:r>
+        <w:t xml:space="preserve">When you click on the dequeue button it will remove the numbers from the front. </w:t>
+      </w:r>
+      <w:r>
+        <w:t xml:space="preserve">Number one is removed from the queue. </w:t>
+      </w:r>
+      <w:r>
+        <w:br/>
+      </w:r>
+    </w:p>
+    <w:p>
+      <w:pPr>
+        <w:pStyle w:val="Heading2"/>
+      </w:pPr>
+      <w:r>
+        <w:t>Task 1.3</w:t>
+      </w:r>
+    </w:p>
+    <w:p>
+      <w:proofErr w:type="spellStart"/>
+      <w:r>
+        <w:t>jub</w:t>
+      </w:r>
+      <w:proofErr w:type="spellEnd"/>
+      <w:r>
+        <w:t xml:space="preserve"> </w:t>
+      </w:r>
+    </w:p>
+    <w:p>
+      <w:pPr>
+        <w:pStyle w:val="Heading2"/>
+      </w:pPr>
+      <w:r>
+        <w:t xml:space="preserve">Task </w:t>
+      </w:r>
+      <w:r>
+        <w:t xml:space="preserve">1. </w:t>
+      </w:r>
+      <w:r>
+        <w:t>4</w:t>
+      </w:r>
+    </w:p>
+    <w:p>
+      <w:pPr>
+        <w:pStyle w:val="Heading3"/>
       </w:pPr>
       <w:r>
         <w:t xml:space="preserve">Errors and issues </w:t>
@@ -22,9 +367,515 @@
         <w:t>One error I came acro</w:t>
       </w:r>
       <w:r>
-        <w:t xml:space="preserve">ss during this assignment when it came to the week 10 tasks </w:t>
+        <w:t xml:space="preserve">ss during this assignment when it came to the week 10 </w:t>
+      </w:r>
+      <w:proofErr w:type="gramStart"/>
+      <w:r>
+        <w:t>tasks</w:t>
+      </w:r>
+      <w:proofErr w:type="gramEnd"/>
+      <w:r>
+        <w:t xml:space="preserve"> </w:t>
+      </w:r>
+      <w:r>
+        <w:t>I was unable to compete the week 10 task</w:t>
+      </w:r>
+      <w:r>
+        <w:t xml:space="preserve"> 1.3 challenge task</w:t>
+      </w:r>
+      <w:r>
+        <w:t>. The error that originally showed up was that the code couldn’t find the modules folder</w:t>
+      </w:r>
+      <w:r>
+        <w:t xml:space="preserve"> which had most of the sorting modules stored there. </w:t>
+      </w:r>
+      <w:proofErr w:type="gramStart"/>
+      <w:r>
+        <w:t>However</w:t>
+      </w:r>
+      <w:proofErr w:type="gramEnd"/>
+      <w:r>
+        <w:t xml:space="preserve"> after copying over the folder into the test folder task_1_3_challenge.py was working. </w:t>
       </w:r>
     </w:p>
+    <w:p>
+      <w:pPr>
+        <w:pStyle w:val="Heading2"/>
+        <w:tabs>
+          <w:tab w:val="left" w:pos="1859"/>
+        </w:tabs>
+      </w:pPr>
+      <w:r>
+        <w:lastRenderedPageBreak/>
+        <w:t>Task 2.1</w:t>
+      </w:r>
+      <w:r>
+        <w:tab/>
+      </w:r>
+    </w:p>
+    <w:p>
+      <w:r>
+        <w:rPr>
+          <w:noProof/>
+        </w:rPr>
+        <w:drawing>
+          <wp:anchor distT="0" distB="0" distL="114300" distR="114300" simplePos="0" relativeHeight="251667456" behindDoc="0" locked="0" layoutInCell="1" allowOverlap="1" wp14:anchorId="302FBD3B" wp14:editId="298CA336">
+            <wp:simplePos x="0" y="0"/>
+            <wp:positionH relativeFrom="margin">
+              <wp:posOffset>138224</wp:posOffset>
+            </wp:positionH>
+            <wp:positionV relativeFrom="paragraph">
+              <wp:posOffset>240621</wp:posOffset>
+            </wp:positionV>
+            <wp:extent cx="4220845" cy="1433830"/>
+            <wp:effectExtent l="0" t="0" r="8255" b="0"/>
+            <wp:wrapTopAndBottom/>
+            <wp:docPr id="935142393" name="Picture 1">
+              <a:extLst xmlns:a="http://schemas.openxmlformats.org/drawingml/2006/main">
+                <a:ext uri="{FF2B5EF4-FFF2-40B4-BE49-F238E27FC236}">
+                  <a16:creationId xmlns:a16="http://schemas.microsoft.com/office/drawing/2014/main" id="{0856597B-6814-48F5-B198-2772D43B840B}"/>
+                </a:ext>
+              </a:extLst>
+            </wp:docPr>
+            <wp:cNvGraphicFramePr>
+              <a:graphicFrameLocks xmlns:a="http://schemas.openxmlformats.org/drawingml/2006/main" noChangeAspect="1"/>
+            </wp:cNvGraphicFramePr>
+            <a:graphic xmlns:a="http://schemas.openxmlformats.org/drawingml/2006/main">
+              <a:graphicData uri="http://schemas.openxmlformats.org/drawingml/2006/picture">
+                <pic:pic xmlns:pic="http://schemas.openxmlformats.org/drawingml/2006/picture">
+                  <pic:nvPicPr>
+                    <pic:cNvPr id="935142393" name=""/>
+                    <pic:cNvPicPr/>
+                  </pic:nvPicPr>
+                  <pic:blipFill>
+                    <a:blip r:embed="rId9"/>
+                    <a:stretch>
+                      <a:fillRect/>
+                    </a:stretch>
+                  </pic:blipFill>
+                  <pic:spPr>
+                    <a:xfrm>
+                      <a:off x="0" y="0"/>
+                      <a:ext cx="4220845" cy="1433830"/>
+                    </a:xfrm>
+                    <a:prstGeom prst="rect">
+                      <a:avLst/>
+                    </a:prstGeom>
+                  </pic:spPr>
+                </pic:pic>
+              </a:graphicData>
+            </a:graphic>
+            <wp14:sizeRelH relativeFrom="margin">
+              <wp14:pctWidth>0</wp14:pctWidth>
+            </wp14:sizeRelH>
+            <wp14:sizeRelV relativeFrom="margin">
+              <wp14:pctHeight>0</wp14:pctHeight>
+            </wp14:sizeRelV>
+          </wp:anchor>
+        </w:drawing>
+      </w:r>
+      <w:r>
+        <w:t xml:space="preserve">When you click </w:t>
+      </w:r>
+      <w:proofErr w:type="gramStart"/>
+      <w:r>
+        <w:t>A</w:t>
+      </w:r>
+      <w:proofErr w:type="gramEnd"/>
+      <w:r>
+        <w:t xml:space="preserve"> you can append something to the queue</w:t>
+      </w:r>
+      <w:r>
+        <w:t xml:space="preserve">. It will first ask you to enter a value </w:t>
+      </w:r>
+    </w:p>
+    <w:p/>
+    <w:p>
+      <w:r>
+        <w:rPr>
+          <w:noProof/>
+        </w:rPr>
+        <w:drawing>
+          <wp:anchor distT="0" distB="0" distL="114300" distR="114300" simplePos="0" relativeHeight="251669504" behindDoc="0" locked="0" layoutInCell="1" allowOverlap="1" wp14:anchorId="0705F1F6" wp14:editId="5FFF2AB8">
+            <wp:simplePos x="0" y="0"/>
+            <wp:positionH relativeFrom="margin">
+              <wp:posOffset>329565</wp:posOffset>
+            </wp:positionH>
+            <wp:positionV relativeFrom="paragraph">
+              <wp:posOffset>269240</wp:posOffset>
+            </wp:positionV>
+            <wp:extent cx="3625215" cy="2035810"/>
+            <wp:effectExtent l="0" t="0" r="0" b="2540"/>
+            <wp:wrapTopAndBottom/>
+            <wp:docPr id="1360561426" name="Picture 1">
+              <a:extLst xmlns:a="http://schemas.openxmlformats.org/drawingml/2006/main">
+                <a:ext uri="{FF2B5EF4-FFF2-40B4-BE49-F238E27FC236}">
+                  <a16:creationId xmlns:a16="http://schemas.microsoft.com/office/drawing/2014/main" id="{2A109F08-FEB2-4E7F-99EB-357E5CD13799}"/>
+                </a:ext>
+              </a:extLst>
+            </wp:docPr>
+            <wp:cNvGraphicFramePr>
+              <a:graphicFrameLocks xmlns:a="http://schemas.openxmlformats.org/drawingml/2006/main" noChangeAspect="1"/>
+            </wp:cNvGraphicFramePr>
+            <a:graphic xmlns:a="http://schemas.openxmlformats.org/drawingml/2006/main">
+              <a:graphicData uri="http://schemas.openxmlformats.org/drawingml/2006/picture">
+                <pic:pic xmlns:pic="http://schemas.openxmlformats.org/drawingml/2006/picture">
+                  <pic:nvPicPr>
+                    <pic:cNvPr id="1360561426" name=""/>
+                    <pic:cNvPicPr/>
+                  </pic:nvPicPr>
+                  <pic:blipFill>
+                    <a:blip r:embed="rId10"/>
+                    <a:stretch>
+                      <a:fillRect/>
+                    </a:stretch>
+                  </pic:blipFill>
+                  <pic:spPr>
+                    <a:xfrm>
+                      <a:off x="0" y="0"/>
+                      <a:ext cx="3625215" cy="2035810"/>
+                    </a:xfrm>
+                    <a:prstGeom prst="rect">
+                      <a:avLst/>
+                    </a:prstGeom>
+                  </pic:spPr>
+                </pic:pic>
+              </a:graphicData>
+            </a:graphic>
+            <wp14:sizeRelH relativeFrom="margin">
+              <wp14:pctWidth>0</wp14:pctWidth>
+            </wp14:sizeRelH>
+            <wp14:sizeRelV relativeFrom="margin">
+              <wp14:pctHeight>0</wp14:pctHeight>
+            </wp14:sizeRelV>
+          </wp:anchor>
+        </w:drawing>
+      </w:r>
+      <w:r>
+        <w:t xml:space="preserve">5 was entered into the queue as the first variable </w:t>
+      </w:r>
+    </w:p>
+    <w:p/>
+    <w:p>
+      <w:r>
+        <w:rPr>
+          <w:noProof/>
+        </w:rPr>
+        <w:drawing>
+          <wp:anchor distT="0" distB="0" distL="114300" distR="114300" simplePos="0" relativeHeight="251671552" behindDoc="0" locked="0" layoutInCell="1" allowOverlap="1" wp14:anchorId="650D45BA" wp14:editId="14BEF31F">
+            <wp:simplePos x="0" y="0"/>
+            <wp:positionH relativeFrom="margin">
+              <wp:posOffset>350875</wp:posOffset>
+            </wp:positionH>
+            <wp:positionV relativeFrom="paragraph">
+              <wp:posOffset>488847</wp:posOffset>
+            </wp:positionV>
+            <wp:extent cx="4072255" cy="2195195"/>
+            <wp:effectExtent l="0" t="0" r="4445" b="0"/>
+            <wp:wrapTopAndBottom/>
+            <wp:docPr id="858275111" name="Picture 1">
+              <a:extLst xmlns:a="http://schemas.openxmlformats.org/drawingml/2006/main">
+                <a:ext uri="{FF2B5EF4-FFF2-40B4-BE49-F238E27FC236}">
+                  <a16:creationId xmlns:a16="http://schemas.microsoft.com/office/drawing/2014/main" id="{88DCEC19-DA1A-40CD-8F4D-7C09FBDC1198}"/>
+                </a:ext>
+              </a:extLst>
+            </wp:docPr>
+            <wp:cNvGraphicFramePr>
+              <a:graphicFrameLocks xmlns:a="http://schemas.openxmlformats.org/drawingml/2006/main" noChangeAspect="1"/>
+            </wp:cNvGraphicFramePr>
+            <a:graphic xmlns:a="http://schemas.openxmlformats.org/drawingml/2006/main">
+              <a:graphicData uri="http://schemas.openxmlformats.org/drawingml/2006/picture">
+                <pic:pic xmlns:pic="http://schemas.openxmlformats.org/drawingml/2006/picture">
+                  <pic:nvPicPr>
+                    <pic:cNvPr id="858275111" name=""/>
+                    <pic:cNvPicPr/>
+                  </pic:nvPicPr>
+                  <pic:blipFill>
+                    <a:blip r:embed="rId11"/>
+                    <a:stretch>
+                      <a:fillRect/>
+                    </a:stretch>
+                  </pic:blipFill>
+                  <pic:spPr>
+                    <a:xfrm>
+                      <a:off x="0" y="0"/>
+                      <a:ext cx="4072255" cy="2195195"/>
+                    </a:xfrm>
+                    <a:prstGeom prst="rect">
+                      <a:avLst/>
+                    </a:prstGeom>
+                  </pic:spPr>
+                </pic:pic>
+              </a:graphicData>
+            </a:graphic>
+            <wp14:sizeRelH relativeFrom="margin">
+              <wp14:pctWidth>0</wp14:pctWidth>
+            </wp14:sizeRelH>
+            <wp14:sizeRelV relativeFrom="margin">
+              <wp14:pctHeight>0</wp14:pctHeight>
+            </wp14:sizeRelV>
+          </wp:anchor>
+        </w:drawing>
+      </w:r>
+      <w:r>
+        <w:t xml:space="preserve">A couple other numbers were </w:t>
+      </w:r>
+      <w:proofErr w:type="gramStart"/>
+      <w:r>
+        <w:t>add</w:t>
+      </w:r>
+      <w:proofErr w:type="gramEnd"/>
+      <w:r>
+        <w:t xml:space="preserve"> to the queue </w:t>
+      </w:r>
+      <w:r>
+        <w:t xml:space="preserve">from the back. Keeping the first element entered at the first index. </w:t>
+      </w:r>
+      <w:r>
+        <w:t>Values entered include 5, 5, 7, 2, 3</w:t>
+      </w:r>
+      <w:r>
+        <w:br/>
+      </w:r>
+    </w:p>
+    <w:p>
+      <w:r>
+        <w:rPr>
+          <w:noProof/>
+        </w:rPr>
+        <w:lastRenderedPageBreak/>
+        <w:drawing>
+          <wp:anchor distT="0" distB="0" distL="114300" distR="114300" simplePos="0" relativeHeight="251673600" behindDoc="0" locked="0" layoutInCell="1" allowOverlap="1" wp14:anchorId="0381FC66" wp14:editId="63CE8DB3">
+            <wp:simplePos x="0" y="0"/>
+            <wp:positionH relativeFrom="margin">
+              <wp:posOffset>425302</wp:posOffset>
+            </wp:positionH>
+            <wp:positionV relativeFrom="paragraph">
+              <wp:posOffset>411819</wp:posOffset>
+            </wp:positionV>
+            <wp:extent cx="4124960" cy="2193925"/>
+            <wp:effectExtent l="0" t="0" r="8890" b="0"/>
+            <wp:wrapTopAndBottom/>
+            <wp:docPr id="1560022494" name="Picture 1560022494">
+              <a:extLst xmlns:a="http://schemas.openxmlformats.org/drawingml/2006/main">
+                <a:ext uri="{FF2B5EF4-FFF2-40B4-BE49-F238E27FC236}">
+                  <a16:creationId xmlns:a16="http://schemas.microsoft.com/office/drawing/2014/main" id="{AFEF0269-A00E-4265-BCD2-CE302D6E8C1E}"/>
+                </a:ext>
+              </a:extLst>
+            </wp:docPr>
+            <wp:cNvGraphicFramePr>
+              <a:graphicFrameLocks xmlns:a="http://schemas.openxmlformats.org/drawingml/2006/main" noChangeAspect="1"/>
+            </wp:cNvGraphicFramePr>
+            <a:graphic xmlns:a="http://schemas.openxmlformats.org/drawingml/2006/main">
+              <a:graphicData uri="http://schemas.openxmlformats.org/drawingml/2006/picture">
+                <pic:pic xmlns:pic="http://schemas.openxmlformats.org/drawingml/2006/picture">
+                  <pic:nvPicPr>
+                    <pic:cNvPr id="1560022494" name=""/>
+                    <pic:cNvPicPr/>
+                  </pic:nvPicPr>
+                  <pic:blipFill>
+                    <a:blip r:embed="rId12"/>
+                    <a:stretch>
+                      <a:fillRect/>
+                    </a:stretch>
+                  </pic:blipFill>
+                  <pic:spPr>
+                    <a:xfrm>
+                      <a:off x="0" y="0"/>
+                      <a:ext cx="4124960" cy="2193925"/>
+                    </a:xfrm>
+                    <a:prstGeom prst="rect">
+                      <a:avLst/>
+                    </a:prstGeom>
+                  </pic:spPr>
+                </pic:pic>
+              </a:graphicData>
+            </a:graphic>
+            <wp14:sizeRelH relativeFrom="margin">
+              <wp14:pctWidth>0</wp14:pctWidth>
+            </wp14:sizeRelH>
+            <wp14:sizeRelV relativeFrom="margin">
+              <wp14:pctHeight>0</wp14:pctHeight>
+            </wp14:sizeRelV>
+          </wp:anchor>
+        </w:drawing>
+      </w:r>
+      <w:r>
+        <w:t>When you</w:t>
+      </w:r>
+      <w:r>
+        <w:t xml:space="preserve"> click o</w:t>
+      </w:r>
+      <w:r>
+        <w:t>n th</w:t>
+      </w:r>
+      <w:r>
+        <w:t>e letter</w:t>
+      </w:r>
+      <w:r>
+        <w:t xml:space="preserve"> </w:t>
+      </w:r>
+      <w:r>
+        <w:t>D</w:t>
+      </w:r>
+      <w:r>
+        <w:t xml:space="preserve"> </w:t>
+      </w:r>
+      <w:r>
+        <w:t>it will al</w:t>
+      </w:r>
+      <w:r>
+        <w:t xml:space="preserve">low </w:t>
+      </w:r>
+      <w:r>
+        <w:t>you t</w:t>
+      </w:r>
+      <w:r>
+        <w:t xml:space="preserve">o </w:t>
+      </w:r>
+      <w:r>
+        <w:t xml:space="preserve">delete </w:t>
+      </w:r>
+      <w:r>
+        <w:t>numbers</w:t>
+      </w:r>
+      <w:r>
+        <w:t xml:space="preserve"> </w:t>
+      </w:r>
+      <w:r>
+        <w:br/>
+      </w:r>
+    </w:p>
+    <w:p/>
+    <w:p>
+      <w:r>
+        <w:rPr>
+          <w:noProof/>
+        </w:rPr>
+        <w:drawing>
+          <wp:anchor distT="0" distB="0" distL="114300" distR="114300" simplePos="0" relativeHeight="251675648" behindDoc="0" locked="0" layoutInCell="1" allowOverlap="1" wp14:anchorId="31F91A92" wp14:editId="1B3BF139">
+            <wp:simplePos x="0" y="0"/>
+            <wp:positionH relativeFrom="margin">
+              <wp:posOffset>597032</wp:posOffset>
+            </wp:positionH>
+            <wp:positionV relativeFrom="paragraph">
+              <wp:posOffset>268184</wp:posOffset>
+            </wp:positionV>
+            <wp:extent cx="3503295" cy="2098675"/>
+            <wp:effectExtent l="0" t="0" r="1905" b="0"/>
+            <wp:wrapTopAndBottom/>
+            <wp:docPr id="582973974" name="Picture 582973974">
+              <a:extLst xmlns:a="http://schemas.openxmlformats.org/drawingml/2006/main">
+                <a:ext uri="{FF2B5EF4-FFF2-40B4-BE49-F238E27FC236}">
+                  <a16:creationId xmlns:a16="http://schemas.microsoft.com/office/drawing/2014/main" id="{92671D5A-D2E7-4C19-88C4-60CCAC1B0153}"/>
+                </a:ext>
+              </a:extLst>
+            </wp:docPr>
+            <wp:cNvGraphicFramePr>
+              <a:graphicFrameLocks xmlns:a="http://schemas.openxmlformats.org/drawingml/2006/main" noChangeAspect="1"/>
+            </wp:cNvGraphicFramePr>
+            <a:graphic xmlns:a="http://schemas.openxmlformats.org/drawingml/2006/main">
+              <a:graphicData uri="http://schemas.openxmlformats.org/drawingml/2006/picture">
+                <pic:pic xmlns:pic="http://schemas.openxmlformats.org/drawingml/2006/picture">
+                  <pic:nvPicPr>
+                    <pic:cNvPr id="582973974" name=""/>
+                    <pic:cNvPicPr/>
+                  </pic:nvPicPr>
+                  <pic:blipFill>
+                    <a:blip r:embed="rId13"/>
+                    <a:stretch>
+                      <a:fillRect/>
+                    </a:stretch>
+                  </pic:blipFill>
+                  <pic:spPr>
+                    <a:xfrm>
+                      <a:off x="0" y="0"/>
+                      <a:ext cx="3503295" cy="2098675"/>
+                    </a:xfrm>
+                    <a:prstGeom prst="rect">
+                      <a:avLst/>
+                    </a:prstGeom>
+                  </pic:spPr>
+                </pic:pic>
+              </a:graphicData>
+            </a:graphic>
+            <wp14:sizeRelH relativeFrom="margin">
+              <wp14:pctWidth>0</wp14:pctWidth>
+            </wp14:sizeRelH>
+            <wp14:sizeRelV relativeFrom="margin">
+              <wp14:pctHeight>0</wp14:pctHeight>
+            </wp14:sizeRelV>
+          </wp:anchor>
+        </w:drawing>
+      </w:r>
+      <w:r>
+        <w:t>We w</w:t>
+      </w:r>
+      <w:r>
+        <w:t>ill de</w:t>
+      </w:r>
+      <w:r>
+        <w:t xml:space="preserve">lete </w:t>
+      </w:r>
+      <w:r>
+        <w:t xml:space="preserve">number </w:t>
+      </w:r>
+      <w:r>
+        <w:t xml:space="preserve">5. </w:t>
+      </w:r>
+      <w:r>
+        <w:br/>
+      </w:r>
+    </w:p>
+    <w:p>
+      <w:r>
+        <w:t>If</w:t>
+      </w:r>
+      <w:r>
+        <w:t xml:space="preserve"> you </w:t>
+      </w:r>
+      <w:r>
+        <w:t xml:space="preserve">click </w:t>
+      </w:r>
+      <w:proofErr w:type="gramStart"/>
+      <w:r>
+        <w:t>I</w:t>
+      </w:r>
+      <w:proofErr w:type="gramEnd"/>
+      <w:r>
+        <w:t xml:space="preserve"> </w:t>
+      </w:r>
+      <w:r>
+        <w:t xml:space="preserve">it </w:t>
+      </w:r>
+      <w:r>
+        <w:t>will all</w:t>
+      </w:r>
+      <w:r>
+        <w:t>ow you</w:t>
+      </w:r>
+      <w:r>
+        <w:t xml:space="preserve"> to </w:t>
+      </w:r>
+      <w:r>
+        <w:t xml:space="preserve">insert </w:t>
+      </w:r>
+      <w:r>
+        <w:t>a</w:t>
+      </w:r>
+      <w:r>
+        <w:t xml:space="preserve"> value and depending on the position you tell it to be place it will also insert that value as well. </w:t>
+      </w:r>
+    </w:p>
+    <w:p>
+      <w:pPr>
+        <w:pStyle w:val="Heading2"/>
+      </w:pPr>
+      <w:r>
+        <w:t>Task 2.2</w:t>
+      </w:r>
+    </w:p>
+    <w:p/>
     <w:sectPr>
       <w:pgSz w:w="11906" w:h="16838"/>
       <w:pgMar w:top="1440" w:right="1440" w:bottom="1440" w:left="1440" w:header="708" w:footer="708" w:gutter="0"/>
@@ -605,7 +1456,6 @@
     <w:next w:val="Normal"/>
     <w:link w:val="Heading3Char"/>
     <w:uiPriority w:val="9"/>
-    <w:semiHidden/>
     <w:unhideWhenUsed/>
     <w:qFormat/>
     <w:rsid w:val="0040009B"/>
@@ -832,7 +1682,6 @@
     <w:basedOn w:val="DefaultParagraphFont"/>
     <w:link w:val="Heading3"/>
     <w:uiPriority w:val="9"/>
-    <w:semiHidden/>
     <w:rsid w:val="0040009B"/>
     <w:rPr>
       <w:rFonts w:eastAsiaTheme="majorEastAsia" w:cstheme="majorBidi"/>

</xml_diff>

<commit_message>
First draft of the report
</commit_message>
<xml_diff>
--- a/Report.docx
+++ b/Report.docx
@@ -324,13 +324,69 @@
       </w:r>
     </w:p>
     <w:p>
-      <w:proofErr w:type="spellStart"/>
-      <w:r>
-        <w:t>jub</w:t>
-      </w:r>
-      <w:proofErr w:type="spellEnd"/>
-      <w:r>
-        <w:t xml:space="preserve"> </w:t>
+      <w:r>
+        <w:t xml:space="preserve">Task 1.3 Challenge task was to create a stack </w:t>
+      </w:r>
+      <w:r>
+        <w:t>visualiser</w:t>
+      </w:r>
+      <w:r>
+        <w:t xml:space="preserve">, where you can use the space key to stack on values and using the backspace key to get rid of values. This </w:t>
+      </w:r>
+      <w:r>
+        <w:t xml:space="preserve">is using the stacking algorithm. By only adding and taking away elements from the top, so following the last in first </w:t>
+      </w:r>
+      <w:r>
+        <w:lastRenderedPageBreak/>
+        <w:drawing>
+          <wp:anchor distT="0" distB="0" distL="114300" distR="114300" simplePos="0" relativeHeight="251681792" behindDoc="0" locked="0" layoutInCell="1" allowOverlap="1" wp14:anchorId="5AFE2D49" wp14:editId="1AB12B0C">
+            <wp:simplePos x="0" y="0"/>
+            <wp:positionH relativeFrom="margin">
+              <wp:align>right</wp:align>
+            </wp:positionH>
+            <wp:positionV relativeFrom="paragraph">
+              <wp:posOffset>332398</wp:posOffset>
+            </wp:positionV>
+            <wp:extent cx="5731510" cy="4485005"/>
+            <wp:effectExtent l="0" t="0" r="2540" b="0"/>
+            <wp:wrapTopAndBottom/>
+            <wp:docPr id="1280233091" name="Picture 1"/>
+            <wp:cNvGraphicFramePr>
+              <a:graphicFrameLocks xmlns:a="http://schemas.openxmlformats.org/drawingml/2006/main" noChangeAspect="1"/>
+            </wp:cNvGraphicFramePr>
+            <a:graphic xmlns:a="http://schemas.openxmlformats.org/drawingml/2006/main">
+              <a:graphicData uri="http://schemas.openxmlformats.org/drawingml/2006/picture">
+                <pic:pic xmlns:pic="http://schemas.openxmlformats.org/drawingml/2006/picture">
+                  <pic:nvPicPr>
+                    <pic:cNvPr id="1280233091" name=""/>
+                    <pic:cNvPicPr/>
+                  </pic:nvPicPr>
+                  <pic:blipFill>
+                    <a:blip r:embed="rId9"/>
+                    <a:stretch>
+                      <a:fillRect/>
+                    </a:stretch>
+                  </pic:blipFill>
+                  <pic:spPr>
+                    <a:xfrm>
+                      <a:off x="0" y="0"/>
+                      <a:ext cx="5731510" cy="4485005"/>
+                    </a:xfrm>
+                    <a:prstGeom prst="rect">
+                      <a:avLst/>
+                    </a:prstGeom>
+                  </pic:spPr>
+                </pic:pic>
+              </a:graphicData>
+            </a:graphic>
+          </wp:anchor>
+        </w:drawing>
+      </w:r>
+      <w:r>
+        <w:t xml:space="preserve">out principle. Please refer to the image below showcasing the algorithm. </w:t>
+      </w:r>
+      <w:r>
+        <w:br/>
       </w:r>
     </w:p>
     <w:p>
@@ -345,6 +401,53 @@
       </w:r>
       <w:r>
         <w:t>4</w:t>
+      </w:r>
+    </w:p>
+    <w:p>
+      <w:r>
+        <w:drawing>
+          <wp:anchor distT="0" distB="0" distL="114300" distR="114300" simplePos="0" relativeHeight="251683840" behindDoc="0" locked="0" layoutInCell="1" allowOverlap="1" wp14:anchorId="24D33B6B" wp14:editId="78774323">
+            <wp:simplePos x="0" y="0"/>
+            <wp:positionH relativeFrom="margin">
+              <wp:align>left</wp:align>
+            </wp:positionH>
+            <wp:positionV relativeFrom="paragraph">
+              <wp:posOffset>105459</wp:posOffset>
+            </wp:positionV>
+            <wp:extent cx="5715294" cy="1035103"/>
+            <wp:effectExtent l="0" t="0" r="0" b="0"/>
+            <wp:wrapTopAndBottom/>
+            <wp:docPr id="1869701113" name="Picture 1"/>
+            <wp:cNvGraphicFramePr>
+              <a:graphicFrameLocks xmlns:a="http://schemas.openxmlformats.org/drawingml/2006/main" noChangeAspect="1"/>
+            </wp:cNvGraphicFramePr>
+            <a:graphic xmlns:a="http://schemas.openxmlformats.org/drawingml/2006/main">
+              <a:graphicData uri="http://schemas.openxmlformats.org/drawingml/2006/picture">
+                <pic:pic xmlns:pic="http://schemas.openxmlformats.org/drawingml/2006/picture">
+                  <pic:nvPicPr>
+                    <pic:cNvPr id="1869701113" name=""/>
+                    <pic:cNvPicPr/>
+                  </pic:nvPicPr>
+                  <pic:blipFill>
+                    <a:blip r:embed="rId10"/>
+                    <a:stretch>
+                      <a:fillRect/>
+                    </a:stretch>
+                  </pic:blipFill>
+                  <pic:spPr>
+                    <a:xfrm>
+                      <a:off x="0" y="0"/>
+                      <a:ext cx="5715294" cy="1035103"/>
+                    </a:xfrm>
+                    <a:prstGeom prst="rect">
+                      <a:avLst/>
+                    </a:prstGeom>
+                  </pic:spPr>
+                </pic:pic>
+              </a:graphicData>
+            </a:graphic>
+          </wp:anchor>
+        </w:drawing>
       </w:r>
     </w:p>
     <w:p>
@@ -395,7 +498,13 @@
       </w:r>
       <w:proofErr w:type="gramEnd"/>
       <w:r>
-        <w:t xml:space="preserve"> after copying over the folder into the test folder task_1_3_challenge.py was working. </w:t>
+        <w:t xml:space="preserve"> after copying over the folder into the test folder task_1_</w:t>
+      </w:r>
+      <w:r>
+        <w:t>4</w:t>
+      </w:r>
+      <w:r>
+        <w:t xml:space="preserve">_challenge.py was working. </w:t>
       </w:r>
     </w:p>
     <w:p>
@@ -448,7 +557,7 @@
                     <pic:cNvPicPr/>
                   </pic:nvPicPr>
                   <pic:blipFill>
-                    <a:blip r:embed="rId9"/>
+                    <a:blip r:embed="rId11"/>
                     <a:stretch>
                       <a:fillRect/>
                     </a:stretch>
@@ -525,7 +634,7 @@
                     <pic:cNvPicPr/>
                   </pic:nvPicPr>
                   <pic:blipFill>
-                    <a:blip r:embed="rId10"/>
+                    <a:blip r:embed="rId12"/>
                     <a:stretch>
                       <a:fillRect/>
                     </a:stretch>
@@ -591,7 +700,7 @@
                     <pic:cNvPicPr/>
                   </pic:nvPicPr>
                   <pic:blipFill>
-                    <a:blip r:embed="rId11"/>
+                    <a:blip r:embed="rId13"/>
                     <a:stretch>
                       <a:fillRect/>
                     </a:stretch>
@@ -645,7 +754,7 @@
         </w:rPr>
         <w:lastRenderedPageBreak/>
         <w:drawing>
-          <wp:anchor distT="0" distB="0" distL="114300" distR="114300" simplePos="0" relativeHeight="251673600" behindDoc="0" locked="0" layoutInCell="1" allowOverlap="1" wp14:anchorId="0381FC66" wp14:editId="63CE8DB3">
+          <wp:anchor distT="0" distB="0" distL="114300" distR="114300" simplePos="0" relativeHeight="251673600" behindDoc="0" locked="0" layoutInCell="1" allowOverlap="1" wp14:anchorId="0381FC66" wp14:editId="46319C1B">
             <wp:simplePos x="0" y="0"/>
             <wp:positionH relativeFrom="margin">
               <wp:posOffset>425302</wp:posOffset>
@@ -674,7 +783,7 @@
                     <pic:cNvPicPr/>
                   </pic:nvPicPr>
                   <pic:blipFill>
-                    <a:blip r:embed="rId12"/>
+                    <a:blip r:embed="rId14"/>
                     <a:stretch>
                       <a:fillRect/>
                     </a:stretch>
@@ -753,7 +862,7 @@
           <w:noProof/>
         </w:rPr>
         <w:drawing>
-          <wp:anchor distT="0" distB="0" distL="114300" distR="114300" simplePos="0" relativeHeight="251675648" behindDoc="0" locked="0" layoutInCell="1" allowOverlap="1" wp14:anchorId="31F91A92" wp14:editId="1B3BF139">
+          <wp:anchor distT="0" distB="0" distL="114300" distR="114300" simplePos="0" relativeHeight="251675648" behindDoc="0" locked="0" layoutInCell="1" allowOverlap="1" wp14:anchorId="31F91A92" wp14:editId="0CC4F3AF">
             <wp:simplePos x="0" y="0"/>
             <wp:positionH relativeFrom="margin">
               <wp:posOffset>597032</wp:posOffset>
@@ -782,7 +891,7 @@
                     <pic:cNvPicPr/>
                   </pic:nvPicPr>
                   <pic:blipFill>
-                    <a:blip r:embed="rId13"/>
+                    <a:blip r:embed="rId15"/>
                     <a:stretch>
                       <a:fillRect/>
                     </a:stretch>
@@ -872,9 +981,530 @@
         <w:pStyle w:val="Heading2"/>
       </w:pPr>
       <w:r>
+        <w:lastRenderedPageBreak/>
         <w:t>Task 2.2</w:t>
       </w:r>
     </w:p>
+    <w:p>
+      <w:r>
+        <w:drawing>
+          <wp:anchor distT="0" distB="0" distL="114300" distR="114300" simplePos="0" relativeHeight="251685888" behindDoc="0" locked="0" layoutInCell="1" allowOverlap="1" wp14:anchorId="47D031AC" wp14:editId="45D49895">
+            <wp:simplePos x="0" y="0"/>
+            <wp:positionH relativeFrom="column">
+              <wp:posOffset>337234</wp:posOffset>
+            </wp:positionH>
+            <wp:positionV relativeFrom="paragraph">
+              <wp:posOffset>732839</wp:posOffset>
+            </wp:positionV>
+            <wp:extent cx="3987800" cy="2351405"/>
+            <wp:effectExtent l="0" t="0" r="0" b="0"/>
+            <wp:wrapTopAndBottom/>
+            <wp:docPr id="908390864" name="Picture 1"/>
+            <wp:cNvGraphicFramePr>
+              <a:graphicFrameLocks xmlns:a="http://schemas.openxmlformats.org/drawingml/2006/main" noChangeAspect="1"/>
+            </wp:cNvGraphicFramePr>
+            <a:graphic xmlns:a="http://schemas.openxmlformats.org/drawingml/2006/main">
+              <a:graphicData uri="http://schemas.openxmlformats.org/drawingml/2006/picture">
+                <pic:pic xmlns:pic="http://schemas.openxmlformats.org/drawingml/2006/picture">
+                  <pic:nvPicPr>
+                    <pic:cNvPr id="908390864" name=""/>
+                    <pic:cNvPicPr/>
+                  </pic:nvPicPr>
+                  <pic:blipFill>
+                    <a:blip r:embed="rId16"/>
+                    <a:stretch>
+                      <a:fillRect/>
+                    </a:stretch>
+                  </pic:blipFill>
+                  <pic:spPr>
+                    <a:xfrm>
+                      <a:off x="0" y="0"/>
+                      <a:ext cx="3987800" cy="2351405"/>
+                    </a:xfrm>
+                    <a:prstGeom prst="rect">
+                      <a:avLst/>
+                    </a:prstGeom>
+                  </pic:spPr>
+                </pic:pic>
+              </a:graphicData>
+            </a:graphic>
+            <wp14:sizeRelH relativeFrom="margin">
+              <wp14:pctWidth>0</wp14:pctWidth>
+            </wp14:sizeRelH>
+            <wp14:sizeRelV relativeFrom="margin">
+              <wp14:pctHeight>0</wp14:pctHeight>
+            </wp14:sizeRelV>
+          </wp:anchor>
+        </w:drawing>
+      </w:r>
+      <w:r>
+        <w:t xml:space="preserve">In task 2.2 challenge task, we were asked to create a BTS visualiser allowing us to add new elements, delete, search elements. Order them </w:t>
+      </w:r>
+      <w:r>
+        <w:t xml:space="preserve">by preorder and post ordering. Using the letters or numbers described at the top of the </w:t>
+      </w:r>
+      <w:proofErr w:type="gramStart"/>
+      <w:r>
+        <w:t>pop up</w:t>
+      </w:r>
+      <w:proofErr w:type="gramEnd"/>
+      <w:r>
+        <w:t xml:space="preserve"> window. </w:t>
+      </w:r>
+    </w:p>
+    <w:p/>
+    <w:p>
+      <w:pPr>
+        <w:pStyle w:val="Heading2"/>
+      </w:pPr>
+      <w:r>
+        <w:t xml:space="preserve">Task 2.3 </w:t>
+      </w:r>
+    </w:p>
+    <w:p>
+      <w:r>
+        <w:drawing>
+          <wp:anchor distT="0" distB="0" distL="114300" distR="114300" simplePos="0" relativeHeight="251687936" behindDoc="0" locked="0" layoutInCell="1" allowOverlap="1" wp14:anchorId="1B3B8355" wp14:editId="02055F88">
+            <wp:simplePos x="0" y="0"/>
+            <wp:positionH relativeFrom="margin">
+              <wp:posOffset>1167472</wp:posOffset>
+            </wp:positionH>
+            <wp:positionV relativeFrom="paragraph">
+              <wp:posOffset>593236</wp:posOffset>
+            </wp:positionV>
+            <wp:extent cx="2848610" cy="1894840"/>
+            <wp:effectExtent l="0" t="0" r="8890" b="0"/>
+            <wp:wrapTopAndBottom/>
+            <wp:docPr id="436211720" name="Picture 1"/>
+            <wp:cNvGraphicFramePr>
+              <a:graphicFrameLocks xmlns:a="http://schemas.openxmlformats.org/drawingml/2006/main" noChangeAspect="1"/>
+            </wp:cNvGraphicFramePr>
+            <a:graphic xmlns:a="http://schemas.openxmlformats.org/drawingml/2006/main">
+              <a:graphicData uri="http://schemas.openxmlformats.org/drawingml/2006/picture">
+                <pic:pic xmlns:pic="http://schemas.openxmlformats.org/drawingml/2006/picture">
+                  <pic:nvPicPr>
+                    <pic:cNvPr id="436211720" name=""/>
+                    <pic:cNvPicPr/>
+                  </pic:nvPicPr>
+                  <pic:blipFill>
+                    <a:blip r:embed="rId17"/>
+                    <a:stretch>
+                      <a:fillRect/>
+                    </a:stretch>
+                  </pic:blipFill>
+                  <pic:spPr>
+                    <a:xfrm>
+                      <a:off x="0" y="0"/>
+                      <a:ext cx="2848610" cy="1894840"/>
+                    </a:xfrm>
+                    <a:prstGeom prst="rect">
+                      <a:avLst/>
+                    </a:prstGeom>
+                  </pic:spPr>
+                </pic:pic>
+              </a:graphicData>
+            </a:graphic>
+            <wp14:sizeRelH relativeFrom="margin">
+              <wp14:pctWidth>0</wp14:pctWidth>
+            </wp14:sizeRelH>
+            <wp14:sizeRelV relativeFrom="margin">
+              <wp14:pctHeight>0</wp14:pctHeight>
+            </wp14:sizeRelV>
+          </wp:anchor>
+        </w:drawing>
+      </w:r>
+      <w:r>
+        <w:t xml:space="preserve">This challenge task asked </w:t>
+      </w:r>
+      <w:r>
+        <w:t>us to visualise a sorting algorithm. Using the three sorting methods we previously learnt in class (bubble, selection and merge)</w:t>
+      </w:r>
+      <w:r>
+        <w:t xml:space="preserve">. Once you click on one of those buttons it will sort the bars from smallest to largest using the sorting methods. </w:t>
+      </w:r>
+    </w:p>
+    <w:p>
+      <w:r>
+        <w:drawing>
+          <wp:anchor distT="0" distB="0" distL="114300" distR="114300" simplePos="0" relativeHeight="251689984" behindDoc="0" locked="0" layoutInCell="1" allowOverlap="1" wp14:anchorId="7E526085" wp14:editId="30F0D454">
+            <wp:simplePos x="0" y="0"/>
+            <wp:positionH relativeFrom="margin">
+              <wp:posOffset>1125366</wp:posOffset>
+            </wp:positionH>
+            <wp:positionV relativeFrom="paragraph">
+              <wp:posOffset>2402156</wp:posOffset>
+            </wp:positionV>
+            <wp:extent cx="2714625" cy="1788795"/>
+            <wp:effectExtent l="0" t="0" r="9525" b="1905"/>
+            <wp:wrapTopAndBottom/>
+            <wp:docPr id="1215360093" name="Picture 1"/>
+            <wp:cNvGraphicFramePr>
+              <a:graphicFrameLocks xmlns:a="http://schemas.openxmlformats.org/drawingml/2006/main" noChangeAspect="1"/>
+            </wp:cNvGraphicFramePr>
+            <a:graphic xmlns:a="http://schemas.openxmlformats.org/drawingml/2006/main">
+              <a:graphicData uri="http://schemas.openxmlformats.org/drawingml/2006/picture">
+                <pic:pic xmlns:pic="http://schemas.openxmlformats.org/drawingml/2006/picture">
+                  <pic:nvPicPr>
+                    <pic:cNvPr id="1215360093" name=""/>
+                    <pic:cNvPicPr/>
+                  </pic:nvPicPr>
+                  <pic:blipFill>
+                    <a:blip r:embed="rId18"/>
+                    <a:stretch>
+                      <a:fillRect/>
+                    </a:stretch>
+                  </pic:blipFill>
+                  <pic:spPr>
+                    <a:xfrm>
+                      <a:off x="0" y="0"/>
+                      <a:ext cx="2714625" cy="1788795"/>
+                    </a:xfrm>
+                    <a:prstGeom prst="rect">
+                      <a:avLst/>
+                    </a:prstGeom>
+                  </pic:spPr>
+                </pic:pic>
+              </a:graphicData>
+            </a:graphic>
+            <wp14:sizeRelH relativeFrom="margin">
+              <wp14:pctWidth>0</wp14:pctWidth>
+            </wp14:sizeRelH>
+            <wp14:sizeRelV relativeFrom="margin">
+              <wp14:pctHeight>0</wp14:pctHeight>
+            </wp14:sizeRelV>
+          </wp:anchor>
+        </w:drawing>
+      </w:r>
+      <w:r>
+        <w:t xml:space="preserve">Once completed you can click on the reset button to reset the bars to the randomised order as before. </w:t>
+      </w:r>
+      <w:r>
+        <w:br/>
+      </w:r>
+    </w:p>
+    <w:p>
+      <w:pPr>
+        <w:pStyle w:val="Heading2"/>
+      </w:pPr>
+      <w:r>
+        <w:lastRenderedPageBreak/>
+        <w:t xml:space="preserve">Task 3.1 </w:t>
+      </w:r>
+    </w:p>
+    <w:p>
+      <w:r>
+        <w:drawing>
+          <wp:anchor distT="0" distB="0" distL="114300" distR="114300" simplePos="0" relativeHeight="251692032" behindDoc="0" locked="0" layoutInCell="1" allowOverlap="1" wp14:anchorId="2A99DEAF" wp14:editId="3F6B811C">
+            <wp:simplePos x="0" y="0"/>
+            <wp:positionH relativeFrom="margin">
+              <wp:posOffset>499306</wp:posOffset>
+            </wp:positionH>
+            <wp:positionV relativeFrom="paragraph">
+              <wp:posOffset>777778</wp:posOffset>
+            </wp:positionV>
+            <wp:extent cx="4458970" cy="2928620"/>
+            <wp:effectExtent l="0" t="0" r="0" b="5080"/>
+            <wp:wrapTopAndBottom/>
+            <wp:docPr id="159700860" name="Picture 1"/>
+            <wp:cNvGraphicFramePr>
+              <a:graphicFrameLocks xmlns:a="http://schemas.openxmlformats.org/drawingml/2006/main" noChangeAspect="1"/>
+            </wp:cNvGraphicFramePr>
+            <a:graphic xmlns:a="http://schemas.openxmlformats.org/drawingml/2006/main">
+              <a:graphicData uri="http://schemas.openxmlformats.org/drawingml/2006/picture">
+                <pic:pic xmlns:pic="http://schemas.openxmlformats.org/drawingml/2006/picture">
+                  <pic:nvPicPr>
+                    <pic:cNvPr id="159700860" name=""/>
+                    <pic:cNvPicPr/>
+                  </pic:nvPicPr>
+                  <pic:blipFill>
+                    <a:blip r:embed="rId19"/>
+                    <a:stretch>
+                      <a:fillRect/>
+                    </a:stretch>
+                  </pic:blipFill>
+                  <pic:spPr>
+                    <a:xfrm>
+                      <a:off x="0" y="0"/>
+                      <a:ext cx="4458970" cy="2928620"/>
+                    </a:xfrm>
+                    <a:prstGeom prst="rect">
+                      <a:avLst/>
+                    </a:prstGeom>
+                  </pic:spPr>
+                </pic:pic>
+              </a:graphicData>
+            </a:graphic>
+            <wp14:sizeRelH relativeFrom="margin">
+              <wp14:pctWidth>0</wp14:pctWidth>
+            </wp14:sizeRelH>
+            <wp14:sizeRelV relativeFrom="margin">
+              <wp14:pctHeight>0</wp14:pctHeight>
+            </wp14:sizeRelV>
+          </wp:anchor>
+        </w:drawing>
+      </w:r>
+      <w:r>
+        <w:t xml:space="preserve">This challenge task was to </w:t>
+      </w:r>
+      <w:r>
+        <w:t>Visualise</w:t>
+      </w:r>
+      <w:r>
+        <w:t xml:space="preserve"> the DFS and BFS searching methods. The current </w:t>
+      </w:r>
+      <w:r>
+        <w:t xml:space="preserve">file does I </w:t>
+      </w:r>
+      <w:proofErr w:type="gramStart"/>
+      <w:r>
+        <w:t>the both</w:t>
+      </w:r>
+      <w:proofErr w:type="gramEnd"/>
+      <w:r>
+        <w:t xml:space="preserve"> searches one after the other, however in our final DSA explore we have implemented buttons to either do the DFS or the BFS. </w:t>
+      </w:r>
+      <w:r>
+        <w:br/>
+      </w:r>
+      <w:r>
+        <w:br/>
+      </w:r>
+    </w:p>
+    <w:p>
+      <w:pPr>
+        <w:pStyle w:val="Heading2"/>
+      </w:pPr>
+      <w:r>
+        <w:t xml:space="preserve">Task 3.2 </w:t>
+      </w:r>
+    </w:p>
+    <w:p>
+      <w:r>
+        <w:drawing>
+          <wp:anchor distT="0" distB="0" distL="114300" distR="114300" simplePos="0" relativeHeight="251694080" behindDoc="0" locked="0" layoutInCell="1" allowOverlap="1" wp14:anchorId="0093B98F" wp14:editId="5A26E412">
+            <wp:simplePos x="0" y="0"/>
+            <wp:positionH relativeFrom="margin">
+              <wp:posOffset>63842</wp:posOffset>
+            </wp:positionH>
+            <wp:positionV relativeFrom="paragraph">
+              <wp:posOffset>275493</wp:posOffset>
+            </wp:positionV>
+            <wp:extent cx="4852035" cy="3337560"/>
+            <wp:effectExtent l="0" t="0" r="5715" b="0"/>
+            <wp:wrapTopAndBottom/>
+            <wp:docPr id="1418012100" name="Picture 1"/>
+            <wp:cNvGraphicFramePr>
+              <a:graphicFrameLocks xmlns:a="http://schemas.openxmlformats.org/drawingml/2006/main" noChangeAspect="1"/>
+            </wp:cNvGraphicFramePr>
+            <a:graphic xmlns:a="http://schemas.openxmlformats.org/drawingml/2006/main">
+              <a:graphicData uri="http://schemas.openxmlformats.org/drawingml/2006/picture">
+                <pic:pic xmlns:pic="http://schemas.openxmlformats.org/drawingml/2006/picture">
+                  <pic:nvPicPr>
+                    <pic:cNvPr id="1418012100" name=""/>
+                    <pic:cNvPicPr/>
+                  </pic:nvPicPr>
+                  <pic:blipFill>
+                    <a:blip r:embed="rId20"/>
+                    <a:stretch>
+                      <a:fillRect/>
+                    </a:stretch>
+                  </pic:blipFill>
+                  <pic:spPr>
+                    <a:xfrm>
+                      <a:off x="0" y="0"/>
+                      <a:ext cx="4852035" cy="3337560"/>
+                    </a:xfrm>
+                    <a:prstGeom prst="rect">
+                      <a:avLst/>
+                    </a:prstGeom>
+                  </pic:spPr>
+                </pic:pic>
+              </a:graphicData>
+            </a:graphic>
+            <wp14:sizeRelH relativeFrom="margin">
+              <wp14:pctWidth>0</wp14:pctWidth>
+            </wp14:sizeRelH>
+            <wp14:sizeRelV relativeFrom="margin">
+              <wp14:pctHeight>0</wp14:pctHeight>
+            </wp14:sizeRelV>
+          </wp:anchor>
+        </w:drawing>
+      </w:r>
+      <w:r>
+        <w:t xml:space="preserve">This task was a queue simulator </w:t>
+      </w:r>
+    </w:p>
+    <w:p>
+      <w:pPr>
+        <w:tabs>
+          <w:tab w:val="left" w:pos="1772"/>
+        </w:tabs>
+      </w:pPr>
+      <w:r>
+        <w:tab/>
+      </w:r>
+    </w:p>
+    <w:p>
+      <w:pPr>
+        <w:tabs>
+          <w:tab w:val="left" w:pos="1772"/>
+        </w:tabs>
+      </w:pPr>
+    </w:p>
+    <w:p>
+      <w:pPr>
+        <w:pStyle w:val="Heading2"/>
+      </w:pPr>
+      <w:r>
+        <w:lastRenderedPageBreak/>
+        <w:t xml:space="preserve">Task 3.3 </w:t>
+      </w:r>
+    </w:p>
+    <w:p>
+      <w:r>
+        <w:drawing>
+          <wp:anchor distT="0" distB="0" distL="114300" distR="114300" simplePos="0" relativeHeight="251696128" behindDoc="0" locked="0" layoutInCell="1" allowOverlap="1" wp14:anchorId="3CF79E59" wp14:editId="24BD5CF2">
+            <wp:simplePos x="0" y="0"/>
+            <wp:positionH relativeFrom="margin">
+              <wp:posOffset>372794</wp:posOffset>
+            </wp:positionH>
+            <wp:positionV relativeFrom="paragraph">
+              <wp:posOffset>516744</wp:posOffset>
+            </wp:positionV>
+            <wp:extent cx="4641850" cy="3353435"/>
+            <wp:effectExtent l="0" t="0" r="6350" b="0"/>
+            <wp:wrapTopAndBottom/>
+            <wp:docPr id="67796682" name="Picture 1"/>
+            <wp:cNvGraphicFramePr>
+              <a:graphicFrameLocks xmlns:a="http://schemas.openxmlformats.org/drawingml/2006/main" noChangeAspect="1"/>
+            </wp:cNvGraphicFramePr>
+            <a:graphic xmlns:a="http://schemas.openxmlformats.org/drawingml/2006/main">
+              <a:graphicData uri="http://schemas.openxmlformats.org/drawingml/2006/picture">
+                <pic:pic xmlns:pic="http://schemas.openxmlformats.org/drawingml/2006/picture">
+                  <pic:nvPicPr>
+                    <pic:cNvPr id="67796682" name=""/>
+                    <pic:cNvPicPr/>
+                  </pic:nvPicPr>
+                  <pic:blipFill>
+                    <a:blip r:embed="rId21"/>
+                    <a:stretch>
+                      <a:fillRect/>
+                    </a:stretch>
+                  </pic:blipFill>
+                  <pic:spPr>
+                    <a:xfrm>
+                      <a:off x="0" y="0"/>
+                      <a:ext cx="4641850" cy="3353435"/>
+                    </a:xfrm>
+                    <a:prstGeom prst="rect">
+                      <a:avLst/>
+                    </a:prstGeom>
+                  </pic:spPr>
+                </pic:pic>
+              </a:graphicData>
+            </a:graphic>
+            <wp14:sizeRelH relativeFrom="margin">
+              <wp14:pctWidth>0</wp14:pctWidth>
+            </wp14:sizeRelH>
+            <wp14:sizeRelV relativeFrom="margin">
+              <wp14:pctHeight>0</wp14:pctHeight>
+            </wp14:sizeRelV>
+          </wp:anchor>
+        </w:drawing>
+      </w:r>
+      <w:r>
+        <w:t xml:space="preserve">This task is broken up into two games one is called the </w:t>
+      </w:r>
+      <w:r>
+        <w:t xml:space="preserve">Grid path </w:t>
+      </w:r>
+      <w:proofErr w:type="gramStart"/>
+      <w:r>
+        <w:t>game</w:t>
+      </w:r>
+      <w:proofErr w:type="gramEnd"/>
+      <w:r>
+        <w:t xml:space="preserve"> and the other one is called the coin flip game. </w:t>
+      </w:r>
+    </w:p>
+    <w:p>
+      <w:pPr>
+        <w:tabs>
+          <w:tab w:val="left" w:pos="1218"/>
+        </w:tabs>
+      </w:pPr>
+      <w:r>
+        <w:drawing>
+          <wp:anchor distT="0" distB="0" distL="114300" distR="114300" simplePos="0" relativeHeight="251698176" behindDoc="0" locked="0" layoutInCell="1" allowOverlap="1" wp14:anchorId="18030341" wp14:editId="4F24849A">
+            <wp:simplePos x="0" y="0"/>
+            <wp:positionH relativeFrom="margin">
+              <wp:align>center</wp:align>
+            </wp:positionH>
+            <wp:positionV relativeFrom="paragraph">
+              <wp:posOffset>3795834</wp:posOffset>
+            </wp:positionV>
+            <wp:extent cx="4592955" cy="3324225"/>
+            <wp:effectExtent l="0" t="0" r="0" b="9525"/>
+            <wp:wrapTopAndBottom/>
+            <wp:docPr id="157016848" name="Picture 1"/>
+            <wp:cNvGraphicFramePr>
+              <a:graphicFrameLocks xmlns:a="http://schemas.openxmlformats.org/drawingml/2006/main" noChangeAspect="1"/>
+            </wp:cNvGraphicFramePr>
+            <a:graphic xmlns:a="http://schemas.openxmlformats.org/drawingml/2006/main">
+              <a:graphicData uri="http://schemas.openxmlformats.org/drawingml/2006/picture">
+                <pic:pic xmlns:pic="http://schemas.openxmlformats.org/drawingml/2006/picture">
+                  <pic:nvPicPr>
+                    <pic:cNvPr id="157016848" name=""/>
+                    <pic:cNvPicPr/>
+                  </pic:nvPicPr>
+                  <pic:blipFill>
+                    <a:blip r:embed="rId22"/>
+                    <a:stretch>
+                      <a:fillRect/>
+                    </a:stretch>
+                  </pic:blipFill>
+                  <pic:spPr>
+                    <a:xfrm>
+                      <a:off x="0" y="0"/>
+                      <a:ext cx="4592955" cy="3324225"/>
+                    </a:xfrm>
+                    <a:prstGeom prst="rect">
+                      <a:avLst/>
+                    </a:prstGeom>
+                  </pic:spPr>
+                </pic:pic>
+              </a:graphicData>
+            </a:graphic>
+            <wp14:sizeRelH relativeFrom="margin">
+              <wp14:pctWidth>0</wp14:pctWidth>
+            </wp14:sizeRelH>
+            <wp14:sizeRelV relativeFrom="margin">
+              <wp14:pctHeight>0</wp14:pctHeight>
+            </wp14:sizeRelV>
+          </wp:anchor>
+        </w:drawing>
+      </w:r>
+      <w:r>
+        <w:tab/>
+      </w:r>
+    </w:p>
+    <w:p>
+      <w:pPr>
+        <w:tabs>
+          <w:tab w:val="left" w:pos="1218"/>
+        </w:tabs>
+      </w:pPr>
+    </w:p>
+    <w:p/>
+    <w:p/>
+    <w:p/>
+    <w:p/>
+    <w:p/>
+    <w:p/>
+    <w:p/>
+    <w:p/>
+    <w:p/>
+    <w:p/>
     <w:p/>
     <w:sectPr>
       <w:pgSz w:w="11906" w:h="16838"/>

</xml_diff>

<commit_message>
Week 13 more changes
</commit_message>
<xml_diff>
--- a/Report.docx
+++ b/Report.docx
@@ -12,6 +12,9 @@
     </w:p>
     <w:p>
       <w:r>
+        <w:rPr>
+          <w:noProof/>
+        </w:rPr>
         <w:drawing>
           <wp:anchor distT="0" distB="0" distL="114300" distR="114300" simplePos="0" relativeHeight="251677696" behindDoc="0" locked="0" layoutInCell="1" allowOverlap="1" wp14:anchorId="14A4076E" wp14:editId="10859BA5">
             <wp:simplePos x="0" y="0"/>
@@ -60,23 +63,7 @@
         <w:t>The team broke down the steps for this assignment</w:t>
       </w:r>
       <w:r>
-        <w:t xml:space="preserve">. </w:t>
-      </w:r>
-      <w:proofErr w:type="gramStart"/>
-      <w:r>
-        <w:t>First</w:t>
-      </w:r>
-      <w:proofErr w:type="gramEnd"/>
-      <w:r>
-        <w:t xml:space="preserve"> we are to complete all the tutorial tasks. Then going through the </w:t>
-      </w:r>
-      <w:proofErr w:type="gramStart"/>
-      <w:r>
-        <w:t>assignment</w:t>
-      </w:r>
-      <w:proofErr w:type="gramEnd"/>
-      <w:r>
-        <w:t xml:space="preserve"> we then broke down which </w:t>
+        <w:t xml:space="preserve">. First we are to complete all the tutorial tasks. Then going through the assignment we then broke down which </w:t>
       </w:r>
       <w:r>
         <w:t>assessed task was to be assigned for the different components in the D</w:t>
@@ -157,6 +144,9 @@
       <w:r>
         <w:t xml:space="preserve"> 1.1 </w:t>
       </w:r>
+      <w:r>
+        <w:t>Challenge</w:t>
+      </w:r>
     </w:p>
     <w:p/>
     <w:p/>
@@ -167,6 +157,9 @@
       </w:pPr>
       <w:r>
         <w:t xml:space="preserve">Task 1.2  </w:t>
+      </w:r>
+      <w:r>
+        <w:t>Challenge</w:t>
       </w:r>
     </w:p>
     <w:p>
@@ -319,9 +312,20 @@
       <w:pPr>
         <w:pStyle w:val="Heading2"/>
       </w:pPr>
+    </w:p>
+    <w:p>
+      <w:pPr>
+        <w:pStyle w:val="Heading2"/>
+      </w:pPr>
       <w:r>
         <w:t>Task 1.3</w:t>
       </w:r>
+      <w:r>
+        <w:t xml:space="preserve"> </w:t>
+      </w:r>
+      <w:r>
+        <w:t>Challenge</w:t>
+      </w:r>
     </w:p>
     <w:p>
       <w:r>
@@ -337,6 +341,9 @@
         <w:t xml:space="preserve">is using the stacking algorithm. By only adding and taking away elements from the top, so following the last in first </w:t>
       </w:r>
       <w:r>
+        <w:rPr>
+          <w:noProof/>
+        </w:rPr>
         <w:lastRenderedPageBreak/>
         <w:drawing>
           <wp:anchor distT="0" distB="0" distL="114300" distR="114300" simplePos="0" relativeHeight="251681792" behindDoc="0" locked="0" layoutInCell="1" allowOverlap="1" wp14:anchorId="5AFE2D49" wp14:editId="1AB12B0C">
@@ -402,9 +409,18 @@
       <w:r>
         <w:t>4</w:t>
       </w:r>
-    </w:p>
-    <w:p>
-      <w:r>
+      <w:r>
+        <w:t xml:space="preserve"> </w:t>
+      </w:r>
+      <w:r>
+        <w:t>Challenge</w:t>
+      </w:r>
+    </w:p>
+    <w:p>
+      <w:r>
+        <w:rPr>
+          <w:noProof/>
+        </w:rPr>
         <w:drawing>
           <wp:anchor distT="0" distB="0" distL="114300" distR="114300" simplePos="0" relativeHeight="251683840" behindDoc="0" locked="0" layoutInCell="1" allowOverlap="1" wp14:anchorId="24D33B6B" wp14:editId="78774323">
             <wp:simplePos x="0" y="0"/>
@@ -470,15 +486,7 @@
         <w:t>One error I came acro</w:t>
       </w:r>
       <w:r>
-        <w:t xml:space="preserve">ss during this assignment when it came to the week 10 </w:t>
-      </w:r>
-      <w:proofErr w:type="gramStart"/>
-      <w:r>
-        <w:t>tasks</w:t>
-      </w:r>
-      <w:proofErr w:type="gramEnd"/>
-      <w:r>
-        <w:t xml:space="preserve"> </w:t>
+        <w:t xml:space="preserve">ss during this assignment when it came to the week 10 tasks </w:t>
       </w:r>
       <w:r>
         <w:t>I was unable to compete the week 10 task</w:t>
@@ -490,15 +498,7 @@
         <w:t>. The error that originally showed up was that the code couldn’t find the modules folder</w:t>
       </w:r>
       <w:r>
-        <w:t xml:space="preserve"> which had most of the sorting modules stored there. </w:t>
-      </w:r>
-      <w:proofErr w:type="gramStart"/>
-      <w:r>
-        <w:t>However</w:t>
-      </w:r>
-      <w:proofErr w:type="gramEnd"/>
-      <w:r>
-        <w:t xml:space="preserve"> after copying over the folder into the test folder task_1_</w:t>
+        <w:t xml:space="preserve"> which had most of the sorting modules stored there. However after copying over the folder into the test folder task_1_</w:t>
       </w:r>
       <w:r>
         <w:t>4</w:t>
@@ -519,7 +519,10 @@
         <w:t>Task 2.1</w:t>
       </w:r>
       <w:r>
-        <w:tab/>
+        <w:t xml:space="preserve"> </w:t>
+      </w:r>
+      <w:r>
+        <w:t>Challenge</w:t>
       </w:r>
     </w:p>
     <w:p>
@@ -584,15 +587,7 @@
         </w:drawing>
       </w:r>
       <w:r>
-        <w:t xml:space="preserve">When you click </w:t>
-      </w:r>
-      <w:proofErr w:type="gramStart"/>
-      <w:r>
-        <w:t>A</w:t>
-      </w:r>
-      <w:proofErr w:type="gramEnd"/>
-      <w:r>
-        <w:t xml:space="preserve"> you can append something to the queue</w:t>
+        <w:t>When you click A you can append something to the queue</w:t>
       </w:r>
       <w:r>
         <w:t xml:space="preserve">. It will first ask you to enter a value </w:t>
@@ -727,15 +722,7 @@
         </w:drawing>
       </w:r>
       <w:r>
-        <w:t xml:space="preserve">A couple other numbers were </w:t>
-      </w:r>
-      <w:proofErr w:type="gramStart"/>
-      <w:r>
-        <w:t>add</w:t>
-      </w:r>
-      <w:proofErr w:type="gramEnd"/>
-      <w:r>
-        <w:t xml:space="preserve"> to the queue </w:t>
+        <w:t xml:space="preserve">A couple other numbers were add to the queue </w:t>
       </w:r>
       <w:r>
         <w:t xml:space="preserve">from the back. Keeping the first element entered at the first index. </w:t>
@@ -944,15 +931,7 @@
         <w:t xml:space="preserve"> you </w:t>
       </w:r>
       <w:r>
-        <w:t xml:space="preserve">click </w:t>
-      </w:r>
-      <w:proofErr w:type="gramStart"/>
-      <w:r>
-        <w:t>I</w:t>
-      </w:r>
-      <w:proofErr w:type="gramEnd"/>
-      <w:r>
-        <w:t xml:space="preserve"> </w:t>
+        <w:t xml:space="preserve">click I </w:t>
       </w:r>
       <w:r>
         <w:t xml:space="preserve">it </w:t>
@@ -984,9 +963,18 @@
         <w:lastRenderedPageBreak/>
         <w:t>Task 2.2</w:t>
       </w:r>
-    </w:p>
-    <w:p>
-      <w:r>
+      <w:r>
+        <w:t xml:space="preserve"> </w:t>
+      </w:r>
+      <w:r>
+        <w:t>Challenge</w:t>
+      </w:r>
+    </w:p>
+    <w:p>
+      <w:r>
+        <w:rPr>
+          <w:noProof/>
+        </w:rPr>
         <w:drawing>
           <wp:anchor distT="0" distB="0" distL="114300" distR="114300" simplePos="0" relativeHeight="251685888" behindDoc="0" locked="0" layoutInCell="1" allowOverlap="1" wp14:anchorId="47D031AC" wp14:editId="45D49895">
             <wp:simplePos x="0" y="0"/>
@@ -1041,15 +1029,7 @@
         <w:t xml:space="preserve">In task 2.2 challenge task, we were asked to create a BTS visualiser allowing us to add new elements, delete, search elements. Order them </w:t>
       </w:r>
       <w:r>
-        <w:t xml:space="preserve">by preorder and post ordering. Using the letters or numbers described at the top of the </w:t>
-      </w:r>
-      <w:proofErr w:type="gramStart"/>
-      <w:r>
-        <w:t>pop up</w:t>
-      </w:r>
-      <w:proofErr w:type="gramEnd"/>
-      <w:r>
-        <w:t xml:space="preserve"> window. </w:t>
+        <w:t xml:space="preserve">by preorder and post ordering. Using the letters or numbers described at the top of the pop up window. </w:t>
       </w:r>
     </w:p>
     <w:p/>
@@ -1060,9 +1040,15 @@
       <w:r>
         <w:t xml:space="preserve">Task 2.3 </w:t>
       </w:r>
-    </w:p>
-    <w:p>
-      <w:r>
+      <w:r>
+        <w:t>Challenge</w:t>
+      </w:r>
+    </w:p>
+    <w:p>
+      <w:r>
+        <w:rPr>
+          <w:noProof/>
+        </w:rPr>
         <w:drawing>
           <wp:anchor distT="0" distB="0" distL="114300" distR="114300" simplePos="0" relativeHeight="251687936" behindDoc="0" locked="0" layoutInCell="1" allowOverlap="1" wp14:anchorId="1B3B8355" wp14:editId="02055F88">
             <wp:simplePos x="0" y="0"/>
@@ -1125,6 +1111,9 @@
     </w:p>
     <w:p>
       <w:r>
+        <w:rPr>
+          <w:noProof/>
+        </w:rPr>
         <w:drawing>
           <wp:anchor distT="0" distB="0" distL="114300" distR="114300" simplePos="0" relativeHeight="251689984" behindDoc="0" locked="0" layoutInCell="1" allowOverlap="1" wp14:anchorId="7E526085" wp14:editId="30F0D454">
             <wp:simplePos x="0" y="0"/>
@@ -1190,9 +1179,18 @@
         <w:lastRenderedPageBreak/>
         <w:t xml:space="preserve">Task 3.1 </w:t>
       </w:r>
-    </w:p>
-    <w:p>
-      <w:r>
+      <w:r>
+        <w:t xml:space="preserve"> </w:t>
+      </w:r>
+      <w:r>
+        <w:t>Challenge</w:t>
+      </w:r>
+    </w:p>
+    <w:p>
+      <w:r>
+        <w:rPr>
+          <w:noProof/>
+        </w:rPr>
         <w:drawing>
           <wp:anchor distT="0" distB="0" distL="114300" distR="114300" simplePos="0" relativeHeight="251692032" behindDoc="0" locked="0" layoutInCell="1" allowOverlap="1" wp14:anchorId="2A99DEAF" wp14:editId="3F6B811C">
             <wp:simplePos x="0" y="0"/>
@@ -1253,15 +1251,7 @@
         <w:t xml:space="preserve"> the DFS and BFS searching methods. The current </w:t>
       </w:r>
       <w:r>
-        <w:t xml:space="preserve">file does I </w:t>
-      </w:r>
-      <w:proofErr w:type="gramStart"/>
-      <w:r>
-        <w:t>the both</w:t>
-      </w:r>
-      <w:proofErr w:type="gramEnd"/>
-      <w:r>
-        <w:t xml:space="preserve"> searches one after the other, however in our final DSA explore we have implemented buttons to either do the DFS or the BFS. </w:t>
+        <w:t xml:space="preserve">file does I the both searches one after the other, however in our final DSA explore we have implemented buttons to either do the DFS or the BFS. </w:t>
       </w:r>
       <w:r>
         <w:br/>
@@ -1277,9 +1267,15 @@
       <w:r>
         <w:t xml:space="preserve">Task 3.2 </w:t>
       </w:r>
-    </w:p>
-    <w:p>
-      <w:r>
+      <w:r>
+        <w:t>Challenge</w:t>
+      </w:r>
+    </w:p>
+    <w:p>
+      <w:r>
+        <w:rPr>
+          <w:noProof/>
+        </w:rPr>
         <w:drawing>
           <wp:anchor distT="0" distB="0" distL="114300" distR="114300" simplePos="0" relativeHeight="251694080" behindDoc="0" locked="0" layoutInCell="1" allowOverlap="1" wp14:anchorId="0093B98F" wp14:editId="5A26E412">
             <wp:simplePos x="0" y="0"/>
@@ -1359,9 +1355,15 @@
         <w:lastRenderedPageBreak/>
         <w:t xml:space="preserve">Task 3.3 </w:t>
       </w:r>
-    </w:p>
-    <w:p>
-      <w:r>
+      <w:r>
+        <w:t>Challenge</w:t>
+      </w:r>
+    </w:p>
+    <w:p>
+      <w:r>
+        <w:rPr>
+          <w:noProof/>
+        </w:rPr>
         <w:drawing>
           <wp:anchor distT="0" distB="0" distL="114300" distR="114300" simplePos="0" relativeHeight="251696128" behindDoc="0" locked="0" layoutInCell="1" allowOverlap="1" wp14:anchorId="3CF79E59" wp14:editId="24BD5CF2">
             <wp:simplePos x="0" y="0"/>
@@ -1416,15 +1418,7 @@
         <w:t xml:space="preserve">This task is broken up into two games one is called the </w:t>
       </w:r>
       <w:r>
-        <w:t xml:space="preserve">Grid path </w:t>
-      </w:r>
-      <w:proofErr w:type="gramStart"/>
-      <w:r>
-        <w:t>game</w:t>
-      </w:r>
-      <w:proofErr w:type="gramEnd"/>
-      <w:r>
-        <w:t xml:space="preserve"> and the other one is called the coin flip game. </w:t>
+        <w:t xml:space="preserve">Grid path game and the other one is called the coin flip game. </w:t>
       </w:r>
     </w:p>
     <w:p>
@@ -1434,6 +1428,9 @@
         </w:tabs>
       </w:pPr>
       <w:r>
+        <w:rPr>
+          <w:noProof/>
+        </w:rPr>
         <w:drawing>
           <wp:anchor distT="0" distB="0" distL="114300" distR="114300" simplePos="0" relativeHeight="251698176" behindDoc="0" locked="0" layoutInCell="1" allowOverlap="1" wp14:anchorId="18030341" wp14:editId="4F24849A">
             <wp:simplePos x="0" y="0"/>

</xml_diff>